<commit_message>
Restringe o relatorio a Questao 1
O escopo da entrega passou a ser so a Questao 1. Remove a secao da Questao 2
do relatorio.md e do docx, mantendo apenas as quatro respostas exigidas
pelo enunciado (justificativa, estrutura de dados, destino dos resultados,
dificuldades) referentes ao questao1.c.

Co-Authored-By: Claude Sonnet 5 <noreply@anthropic.com>
Claude-Session: https://claude.ai/code/session_01KSkkYioErqhAMFwHExuSrw
</commit_message>
<xml_diff>
--- a/atividade-1-memoria-compartilhada/Atividade-1-Memoria-Compartilhada.docx
+++ b/atividade-1-memoria-compartilhada/Atividade-1-Memoria-Compartilhada.docx
@@ -176,150 +176,6 @@
           <w:szCs w:val="24"/>
         </w:rPr>
         <w:t xml:space="preserve">Cada filho precisa anexar a memória por conta própria, o fork não faz isso sozinho. E o segmento tem que ser removido no fim com shmctl, senão fica ocupando memória do sistema.</w:t>
-      </w:r>
-    </w:p>
-    <w:p>
-      <w:pPr>
-        <w:spacing w:after="160" w:line="276"/>
-        <w:jc w:val="both"/>
-      </w:pPr>
-      <w:r>
-        <w:rPr>
-          <w:rFonts w:ascii="Times New Roman" w:cs="Times New Roman" w:eastAsia="Times New Roman" w:hAnsi="Times New Roman"/>
-          <w:b/>
-          <w:bCs/>
-          <w:sz w:val="24"/>
-          <w:szCs w:val="24"/>
-        </w:rPr>
-        <w:t xml:space="preserve">Questão 2</w:t>
-      </w:r>
-    </w:p>
-    <w:p>
-      <w:pPr>
-        <w:spacing w:after="160" w:line="276"/>
-        <w:jc w:val="both"/>
-      </w:pPr>
-      <w:r>
-        <w:rPr>
-          <w:rFonts w:ascii="Times New Roman" w:cs="Times New Roman" w:eastAsia="Times New Roman" w:hAnsi="Times New Roman"/>
-          <w:b/>
-          <w:bCs/>
-          <w:sz w:val="24"/>
-          <w:szCs w:val="24"/>
-        </w:rPr>
-        <w:t xml:space="preserve">Justificativa da quantidade de processos adotada.</w:t>
-      </w:r>
-    </w:p>
-    <w:p>
-      <w:pPr>
-        <w:spacing w:after="160" w:line="276"/>
-        <w:jc w:val="both"/>
-      </w:pPr>
-      <w:r>
-        <w:rPr>
-          <w:rFonts w:ascii="Times New Roman" w:cs="Times New Roman" w:eastAsia="Times New Roman" w:hAnsi="Times New Roman"/>
-          <w:b w:val="false"/>
-          <w:bCs w:val="false"/>
-          <w:sz w:val="24"/>
-          <w:szCs w:val="24"/>
-        </w:rPr>
-        <w:t xml:space="preserve">Cinco processos filhos. 10000 divide exatamente por 5, 2000 elementos por processo.</w:t>
-      </w:r>
-    </w:p>
-    <w:p>
-      <w:pPr>
-        <w:spacing w:after="160" w:line="276"/>
-        <w:jc w:val="both"/>
-      </w:pPr>
-      <w:r>
-        <w:rPr>
-          <w:rFonts w:ascii="Times New Roman" w:cs="Times New Roman" w:eastAsia="Times New Roman" w:hAnsi="Times New Roman"/>
-          <w:b/>
-          <w:bCs/>
-          <w:sz w:val="24"/>
-          <w:szCs w:val="24"/>
-        </w:rPr>
-        <w:t xml:space="preserve">Estrutura de dados utilizada para armazenar os resultados.</w:t>
-      </w:r>
-    </w:p>
-    <w:p>
-      <w:pPr>
-        <w:spacing w:after="160" w:line="276"/>
-        <w:jc w:val="both"/>
-      </w:pPr>
-      <w:r>
-        <w:rPr>
-          <w:rFonts w:ascii="Times New Roman" w:cs="Times New Roman" w:eastAsia="Times New Roman" w:hAnsi="Times New Roman"/>
-          <w:b w:val="false"/>
-          <w:bCs w:val="false"/>
-          <w:sz w:val="24"/>
-          <w:szCs w:val="24"/>
-        </w:rPr>
-        <w:t xml:space="preserve">Um vetor de 5 valores long em memória compartilhada, uma posição por soma parcial.</w:t>
-      </w:r>
-    </w:p>
-    <w:p>
-      <w:pPr>
-        <w:spacing w:after="160" w:line="276"/>
-        <w:jc w:val="both"/>
-      </w:pPr>
-      <w:r>
-        <w:rPr>
-          <w:rFonts w:ascii="Times New Roman" w:cs="Times New Roman" w:eastAsia="Times New Roman" w:hAnsi="Times New Roman"/>
-          <w:b/>
-          <w:bCs/>
-          <w:sz w:val="24"/>
-          <w:szCs w:val="24"/>
-        </w:rPr>
-        <w:t xml:space="preserve">Para onde os resultados foram enviados.</w:t>
-      </w:r>
-    </w:p>
-    <w:p>
-      <w:pPr>
-        <w:spacing w:after="160" w:line="276"/>
-        <w:jc w:val="both"/>
-      </w:pPr>
-      <w:r>
-        <w:rPr>
-          <w:rFonts w:ascii="Times New Roman" w:cs="Times New Roman" w:eastAsia="Times New Roman" w:hAnsi="Times New Roman"/>
-          <w:b w:val="false"/>
-          <w:bCs w:val="false"/>
-          <w:sz w:val="24"/>
-          <w:szCs w:val="24"/>
-        </w:rPr>
-        <w:t xml:space="preserve">Memória compartilhada. O pai soma as 5 posições e divide por 10000 para obter a média.</w:t>
-      </w:r>
-    </w:p>
-    <w:p>
-      <w:pPr>
-        <w:spacing w:after="160" w:line="276"/>
-        <w:jc w:val="both"/>
-      </w:pPr>
-      <w:r>
-        <w:rPr>
-          <w:rFonts w:ascii="Times New Roman" w:cs="Times New Roman" w:eastAsia="Times New Roman" w:hAnsi="Times New Roman"/>
-          <w:b/>
-          <w:bCs/>
-          <w:sz w:val="24"/>
-          <w:szCs w:val="24"/>
-        </w:rPr>
-        <w:t xml:space="preserve">Dificuldades encontradas.</w:t>
-      </w:r>
-    </w:p>
-    <w:p>
-      <w:pPr>
-        <w:spacing w:after="160" w:line="276"/>
-        <w:jc w:val="both"/>
-      </w:pPr>
-      <w:r>
-        <w:rPr>
-          <w:rFonts w:ascii="Times New Roman" w:cs="Times New Roman" w:eastAsia="Times New Roman" w:hAnsi="Times New Roman"/>
-          <w:b w:val="false"/>
-          <w:bCs w:val="false"/>
-          <w:sz w:val="24"/>
-          <w:szCs w:val="24"/>
-        </w:rPr>
-        <w:t xml:space="preserve">Com esses valores a soma não chega a estourar int, mas usei long para não depender da faixa. E o pai só pode ler a memória depois que todos os filhos terminarem, garantido com wait em loop.</w:t>
       </w:r>
     </w:p>
     <w:sectPr>

</xml_diff>